<commit_message>
docs: remove circular dependencies from v2 plan
</commit_message>
<xml_diff>
--- a/docs/word/Efinix_2D图像渲染V2一周升级计划书_以太网资源服务版.docx
+++ b/docs/word/Efinix_2D图像渲染V2一周升级计划书_以太网资源服务版.docx
@@ -1024,7 +1024,7 @@
           <w:b w:val="0"/>
           <w:sz w:val="20"/>
         </w:rPr>
-        <w:t>先写能失败的最小测试，再实现模块；每一天形成可单独审核的提交，不把三个人文件混在一个提交里。</w:t>
+        <w:t>先写能失败的最小测试，再实现模块；每一天形成可单独审核的提交，不把三个人文件混在一个提交里。所有跨角色接口在第 1 天合同中冻结；后续任务只能依赖前一日成果或当天明确早于自己的检查点，禁止双方互相等待当天实现。</w:t>
       </w:r>
     </w:p>
     <w:p>
@@ -1048,7 +1048,7 @@
         <w:pageBreakBefore w:val="0"/>
       </w:pPr>
       <w:r>
-        <w:t>第 1 天：冻结 V2 合同，开始补缺口与千兆网复用</w:t>
+        <w:t>第 1 天：先提取 GE 参数，再冻结 V2 合同并启动实现</w:t>
       </w:r>
     </w:p>
     <w:tbl>
@@ -1135,7 +1135,7 @@
                 <w:b w:val="0"/>
                 <w:sz w:val="17"/>
               </w:rPr>
-              <w:t>冻结 960×540 显存地址、Asset DMA 流接口、32 字节 UDP 头、三路 DDR 仲裁优先级；补充现有计数器快照/清零/64 位进位测试，不增加无实际消费者的新计数器。</w:t>
+              <w:t>接收 A 上午提交的 GE 参数清单后，冻结 960×540 显存地址、Asset DMA 流接口、32 字节 UDP 头、stress vector 格式、FIFO 深度/水位和三路 DDR 仲裁优先级；补充现有计数器快照/清零/64 位进位测试，不增加无实际消费者的新计数器。</w:t>
             </w:r>
           </w:p>
           <w:p>
@@ -1157,7 +1157,7 @@
                 <w:b w:val="0"/>
                 <w:sz w:val="17"/>
               </w:rPr>
-              <w:t>现有 GpuMemoryMap、GpuPerfCounters、DdrQosArbiter、任务书缺口。</w:t>
+              <w:t>现有 GpuMemoryMap、GpuPerfCounters、DdrQosArbiter、任务书缺口，以及 A 在 10:00 前提交的官方 GE 时钟、数据宽度和引脚参数清单。</w:t>
             </w:r>
           </w:p>
           <w:p>
@@ -1179,7 +1179,7 @@
                 <w:b w:val="0"/>
                 <w:sz w:val="17"/>
               </w:rPr>
-              <w:t>A、B 可直接引用的唯一接口合同；计数器测试通过。</w:t>
+              <w:t>12:00 前形成 A、B 可直接引用的唯一接口合同；计数器测试通过。</w:t>
             </w:r>
           </w:p>
           <w:p>
@@ -1201,7 +1201,7 @@
                 <w:b w:val="0"/>
                 <w:sz w:val="17"/>
               </w:rPr>
-              <w:t>V1 寄存器保持兼容；等待 A 确认官方 GE 时钟/数据宽度。</w:t>
+              <w:t>V1 寄存器保持兼容；只依赖 A 的上午参数清单，不依赖 A 当天 wrapper 实现。</w:t>
             </w:r>
           </w:p>
           <w:p>
@@ -1297,7 +1297,7 @@
                 <w:b w:val="0"/>
                 <w:sz w:val="17"/>
               </w:rPr>
-              <w:t>board/efinix_ti60/vendor/ge_udp/**；board/efinix_ti60/vendor/manifest.sha256；board/efinix_ti60/rtl/net/efinix_ge_mac_wrapper.v；tb/verilog/tb_efinix_ge_mac_wrapper.sv</w:t>
+              <w:t>docs/efinix_2d_gpu/ge_params.md；board/efinix_ti60/vendor/ge_udp/**；board/efinix_ti60/vendor/manifest.sha256；board/efinix_ti60/rtl/net/efinix_ge_mac_wrapper.v；tb/verilog/tb_efinix_ge_mac_wrapper.sv</w:t>
             </w:r>
           </w:p>
           <w:p>
@@ -1319,7 +1319,7 @@
                 <w:b w:val="0"/>
                 <w:sz w:val="17"/>
               </w:rPr>
-              <w:t>从官方 04_Ti60F225_tse_hj_demo_v5 只复制 RGMII/GMII、MAC、ARP/IP/UDP、PHY 配置及其 IP 依赖；wrapper 把官方 UDP RAM 接口转换为 rx_byte/rx_valid/rx_last/rx_length，并暴露 link/speed。</w:t>
+              <w:t>上午只读检查官方 04_Ti60F225_tse_hj_demo_v5，先登记 RGMII/GMII、MAC、ARP/IP/UDP、PHY 的时钟、宽度、引脚和 IP 依赖；负责人冻结合同后再复制 vendor，并把官方 UDP RAM 接口转换为 rx_byte/rx_valid/rx_last/rx_length，暴露 link/speed。</w:t>
             </w:r>
           </w:p>
           <w:p>
@@ -1341,7 +1341,7 @@
                 <w:b w:val="0"/>
                 <w:sz w:val="17"/>
               </w:rPr>
-              <w:t>板上 RGMII RX、MDIO、复位和官方 GE 源文件。</w:t>
+              <w:t>上午参数清单仅使用板卡资料和官方 GE 源文件；下午 wrapper 使用负责人 12:00 前冻结的 v2_interface_contract.md。</w:t>
             </w:r>
           </w:p>
           <w:p>
@@ -1385,7 +1385,7 @@
                 <w:b w:val="0"/>
                 <w:sz w:val="17"/>
               </w:rPr>
-              <w:t>负责人 v2_interface_contract.md；官方 GE 引脚与时钟定义。</w:t>
+              <w:t>10:00 前的 ge_params.md 不依赖负责人；wrapper 阶段单向依赖负责人中午发布的接口合同。</w:t>
             </w:r>
           </w:p>
           <w:p>
@@ -1407,7 +1407,7 @@
                 <w:b w:val="0"/>
                 <w:sz w:val="17"/>
               </w:rPr>
-              <w:t>vendor 哈希全部匹配；回环测试接收 64/1024 字节包且坏校验包不产生 rx_valid。</w:t>
+              <w:t>参数清单与官方工程一致；vendor 哈希全部匹配；回环测试接收 64/1024 字节包且坏校验包不产生 rx_valid。</w:t>
             </w:r>
           </w:p>
         </w:tc>
@@ -1718,7 +1718,7 @@
                 <w:b w:val="0"/>
                 <w:sz w:val="17"/>
               </w:rPr>
-              <w:t>B 生成的固定命令向量；现有 APB/AXI 仿真内存模型。</w:t>
+              <w:t>第 1 天合同中的 stress vector 记录格式、负责人自生成的固定命令向量和现有 APB/AXI 仿真内存模型；B 当日文件只用于下午交叉验收。</w:t>
             </w:r>
           </w:p>
           <w:p>
@@ -1762,7 +1762,7 @@
                 <w:b w:val="0"/>
                 <w:sz w:val="17"/>
               </w:rPr>
-              <w:t>B 的 stress_vectors.bin 格式；A 无依赖。</w:t>
+              <w:t>第 1 天已冻结的向量格式；不依赖 B 当天实现，A 无依赖。</w:t>
             </w:r>
           </w:p>
           <w:p>
@@ -1784,7 +1784,7 @@
                 <w:b w:val="0"/>
                 <w:sz w:val="17"/>
               </w:rPr>
-              <w:t>全部档位无命令丢失/乱序；报告明确硬件仿真结果不冒充板上 FPS。</w:t>
+              <w:t>自生成向量先完成全部档位验证，再读取 B 提交的 stress_vectors.bin 交叉检查；无命令丢失/乱序，且报告不把仿真结果冒充板上 FPS。</w:t>
             </w:r>
           </w:p>
         </w:tc>
@@ -2108,7 +2108,7 @@
                 <w:b w:val="0"/>
                 <w:sz w:val="17"/>
               </w:rPr>
-              <w:t>屏幕/UART 显示 current tier、p5 FPS、underflow、稳定上限；生成命令向量供负责人测试。</w:t>
+              <w:t>11:00 前提交 stress_vectors.bin；屏幕/UART 显示 current tier、p5 FPS、underflow 和稳定上限。</w:t>
             </w:r>
           </w:p>
           <w:p>
@@ -2279,7 +2279,7 @@
                 <w:b w:val="0"/>
                 <w:sz w:val="17"/>
               </w:rPr>
-              <w:t>Sapphire APB；A 的 meta 流；B 的请求参数。</w:t>
+              <w:t>Sapphire APB，以及第 1 天合同定义的 meta 字段、请求参数和资源地址边界；测试使用本地 source/sink 模型。</w:t>
             </w:r>
           </w:p>
           <w:p>
@@ -2507,7 +2507,7 @@
                 <w:b w:val="0"/>
                 <w:sz w:val="17"/>
               </w:rPr>
-              <w:t>第 1-2 天 wrapper、asset_protocol.vh 和负责人寄存器合同。</w:t>
+              <w:t>第 1-2 天 wrapper、asset_protocol.vh 和第 1 天已冻结的请求/meta/payload 接口；不依赖负责人第 3 天实现。</w:t>
             </w:r>
           </w:p>
           <w:p>
@@ -2731,7 +2731,7 @@
         <w:pageBreakBefore w:val="0"/>
       </w:pPr>
       <w:r>
-        <w:t>第 4 天：完成 DDR 资源写入、重试和缓存提交</w:t>
+        <w:t>第 4 天：按冻结接口并行完成 DDR 写入、保护、重试和缓存</w:t>
       </w:r>
     </w:p>
     <w:tbl>
@@ -2818,7 +2818,7 @@
                 <w:b w:val="0"/>
                 <w:sz w:val="17"/>
               </w:rPr>
-              <w:t>接收 A 的 payload 流，按描述符生成不跨 4 KB 的 AXI INCR 写 burst；只在完整包写成功后更新 committed_offset/sequence；错误或 ABORT 时停止且不越界。</w:t>
+              <w:t>按第 1 天合同接收受保护的 meta/payload 流，按描述符生成不跨 4 KB 的 AXI INCR 写 burst；只在完整包写成功后更新 committed_offset/sequence；错误或 ABORT 时停止且不越界。</w:t>
             </w:r>
           </w:p>
           <w:p>
@@ -2840,7 +2840,7 @@
                 <w:b w:val="0"/>
                 <w:sz w:val="17"/>
               </w:rPr>
-              <w:t>AssetDmaRegs 描述符、meta/payload 流、DDR AXI 写响应。</w:t>
+              <w:t>AssetDmaRegs 描述符、第 1 天冻结的 meta/payload 握手、DDR AXI 写响应；单元测试使用本地流量源。</w:t>
             </w:r>
           </w:p>
           <w:p>
@@ -2884,7 +2884,7 @@
                 <w:b w:val="0"/>
                 <w:sz w:val="17"/>
               </w:rPr>
-              <w:t>第 3 天寄存器；A 的 CDC 输出。</w:t>
+              <w:t>第 3 天寄存器和第 1 天流接口合同；不依赖 A 当天 stream guard 实现。</w:t>
             </w:r>
           </w:p>
           <w:p>
@@ -2906,7 +2906,7 @@
                 <w:b w:val="0"/>
                 <w:sz w:val="17"/>
               </w:rPr>
-              <w:t>1/2/3/1023/1024 字节、非整字尾、4 KB 边界、BVALID 错误和随机反压测试通过。</w:t>
+              <w:t>先用本地流量源通过 1/2/3/1023/1024 字节、非整字尾、4 KB 边界、BVALID 错误和随机反压，再与 A 的 guard 联合仿真。</w:t>
             </w:r>
           </w:p>
         </w:tc>
@@ -3002,7 +3002,7 @@
                 <w:b w:val="0"/>
                 <w:sz w:val="17"/>
               </w:rPr>
-              <w:t>在 RX FIFO 与 AssetDmaWriter 之间检查 payload 长度、last 位置、包内字节数和超时；协议异常时丢弃到包尾并输出单周期错误，不让残包污染下一包。</w:t>
+              <w:t>按第 1 天合同在 RX FIFO 与 DMA sink 之间检查 payload 长度、last 位置、包内字节数和超时；协议异常时丢弃到包尾并输出单周期错误，不让残包污染下一包。</w:t>
             </w:r>
           </w:p>
           <w:p>
@@ -3024,7 +3024,7 @@
                 <w:b w:val="0"/>
                 <w:sz w:val="17"/>
               </w:rPr>
-              <w:t>asset_udp_rx 元数据/载荷；DMA ready；GPU/网络时钟和复位。</w:t>
+              <w:t>asset_udp_rx 元数据/载荷、第 1 天冻结的 DMA ready/abort 握手、GPU/网络时钟和复位；单元测试使用本地 DMA sink。</w:t>
             </w:r>
           </w:p>
           <w:p>
@@ -3068,7 +3068,7 @@
                 <w:b w:val="0"/>
                 <w:sz w:val="17"/>
               </w:rPr>
-              <w:t>第 2-3 天网络模块；负责人 DMA ready/abort。</w:t>
+              <w:t>第 2-3 天 A 自有网络模块和第 1 天流接口合同；不依赖负责人当天 Writer 实现。</w:t>
             </w:r>
           </w:p>
           <w:p>
@@ -3090,7 +3090,7 @@
                 <w:b w:val="0"/>
                 <w:sz w:val="17"/>
               </w:rPr>
-              <w:t>端到端仿真注入截断、超长、乱序、重复、随机反压和异步复位，后续合法包仍正确。</w:t>
+              <w:t>先用本地 DMA sink 覆盖截断、超长、乱序、重复、随机反压和异步复位，再与负责人 Writer 联合仿真；后续合法包仍正确。</w:t>
             </w:r>
           </w:p>
         </w:tc>
@@ -3292,7 +3292,7 @@
         <w:pageBreakBefore w:val="0"/>
       </w:pPr>
       <w:r>
-        <w:t>第 5 天：全屏显示与开源植物防线逻辑移植</w:t>
+        <w:t>第 5 天：按冻结显示参数并行完成全屏路径与游戏逻辑</w:t>
       </w:r>
     </w:p>
     <w:tbl>
@@ -3445,7 +3445,7 @@
                 <w:b w:val="0"/>
                 <w:sz w:val="17"/>
               </w:rPr>
-              <w:t>第 4 天 AssetDmaWriter；A 的 FIFO 水位阈值。</w:t>
+              <w:t>第 4 天 AssetDmaWriter，以及第 1 天已冻结的 960×540、stride、FIFO 深度和 low/high 水位；不依赖 A 当天显示实现。</w:t>
             </w:r>
           </w:p>
           <w:p>
@@ -3585,7 +3585,7 @@
                 <w:b w:val="0"/>
                 <w:sz w:val="17"/>
               </w:rPr>
-              <w:t>960 像素行流、line_last/frame_last、1080p 时序。</w:t>
+              <w:t>第 1 天合同定义的 960 像素行流、line_last/frame_last、FIFO 水位和 1080p 时序；测试使用本地 scanout source。</w:t>
             </w:r>
           </w:p>
           <w:p>
@@ -3629,7 +3629,7 @@
                 <w:b w:val="0"/>
                 <w:sz w:val="17"/>
               </w:rPr>
-              <w:t>负责人 Scanout 参数；官方 HDMI encoder/serializer。</w:t>
+              <w:t>第 1 天已冻结的 Scanout/显示参数和官方 HDMI encoder/serializer；不依赖负责人第 5 天实现。</w:t>
             </w:r>
           </w:p>
           <w:p>
@@ -3853,7 +3853,7 @@
         <w:pageBreakBefore w:val="0"/>
       </w:pPr>
       <w:r>
-        <w:t>第 6 天：生成植物防线画面并完成板级网络/显示集成</w:t>
+        <w:t>第 6 天：先生成 GPU 核心，再完成画面与板级网络/显示集成</w:t>
       </w:r>
     </w:p>
     <w:tbl>
@@ -3962,7 +3962,7 @@
                 <w:b w:val="0"/>
                 <w:sz w:val="17"/>
               </w:rPr>
-              <w:t>APB、DDR AXI、A 的网络流与显示 FIFO、B 的寄存器合同。</w:t>
+              <w:t>APB、DDR AXI、第 1 天冻结的网络流/显示 FIFO 接口，以及本地网络 source 和显示 sink 模型。</w:t>
             </w:r>
           </w:p>
           <w:p>
@@ -3984,7 +3984,7 @@
                 <w:b w:val="0"/>
                 <w:sz w:val="17"/>
               </w:rPr>
-              <w:t>可综合顶层；GPU、Scanout、Asset 同时工作的端到端仿真。</w:t>
+              <w:t>12:00 前提交可综合顶层和拆分 RTL；GPU、Scanout、Asset 同时工作的端到端仿真。</w:t>
             </w:r>
           </w:p>
           <w:p>
@@ -4006,7 +4006,7 @@
                 <w:b w:val="0"/>
                 <w:sz w:val="17"/>
               </w:rPr>
-              <w:t>第 3-5 天全部模块。</w:t>
+              <w:t>负责人第 3-5 天 Chisel 模块和第 1 天接口合同；不依赖 A 的 board_top 或 B 的当天文件。</w:t>
             </w:r>
           </w:p>
           <w:p>
@@ -4146,7 +4146,7 @@
                 <w:b w:val="0"/>
                 <w:sz w:val="17"/>
               </w:rPr>
-              <w:t>负责人生成 RTL、官方 GE/DDR/HDMI IP、板卡引脚。</w:t>
+              <w:t>负责人 12:00 前提交的生成 RTL、A 第 1-5 天模块、官方 GE/DDR/HDMI IP 和板卡引脚。</w:t>
             </w:r>
           </w:p>
           <w:p>
@@ -4190,7 +4190,7 @@
                 <w:b w:val="0"/>
                 <w:sz w:val="17"/>
               </w:rPr>
-              <w:t>第 1-5 天 A 模块和负责人顶层。</w:t>
+              <w:t>第 1-5 天 A 自有模块；单向依赖负责人第 6 天中午发布的 GPU core，不被负责人当天反向依赖。</w:t>
             </w:r>
           </w:p>
           <w:p>
@@ -4374,7 +4374,7 @@
                 <w:b w:val="0"/>
                 <w:sz w:val="17"/>
               </w:rPr>
-              <w:t>第 4 天缓存、第 5 天 game、A 全屏显示。</w:t>
+              <w:t>第 4 天缓存、第 5 天 game，以及第 1 天冻结的 960×540 framebuffer/AetherGX 命令合同；不依赖 A 当天板级显示实现。</w:t>
             </w:r>
           </w:p>
           <w:p>
@@ -4414,7 +4414,7 @@
         <w:pageBreakBefore w:val="0"/>
       </w:pPr>
       <w:r>
-        <w:t>第 7 天：统一上板、性能封版与 V2 交付</w:t>
+        <w:t>第 7 天：按 RC0、固件、位流、板测、封版顺序交付</w:t>
       </w:r>
     </w:p>
     <w:tbl>
@@ -4501,7 +4501,7 @@
                 <w:b w:val="0"/>
                 <w:sz w:val="17"/>
               </w:rPr>
-              <w:t>审核三路 DDR 性能和所有计数，依据实测只调 FIFO 水位和仲裁阈值；冻结生成 RTL 与寄存器版本，不再增加功能。</w:t>
+              <w:t>依据第 6 天联合仿真和已有板测基线只调 FIFO 水位/仲裁阈值，09:00 冻结 RC0 生成 RTL与寄存器版本；A/B 使用 RC0 完成板测后，只审核计数并生成验收记录和 SHA256，不再修改功能。</w:t>
             </w:r>
           </w:p>
           <w:p>
@@ -4523,7 +4523,7 @@
                 <w:b w:val="0"/>
                 <w:sz w:val="17"/>
               </w:rPr>
-              <w:t>A 的 Efinity 报告与板测计数；B 的 CSV/CRC/稳定上限。</w:t>
+              <w:t>RC0 阶段只使用第 6 天生成物和测试结果；封版阶段再读取 A 的 Efinity/板测报告与 B 的 CSV/CRC/稳定上限。</w:t>
             </w:r>
           </w:p>
           <w:p>
@@ -4567,7 +4567,7 @@
                 <w:b w:val="0"/>
                 <w:sz w:val="17"/>
               </w:rPr>
-              <w:t>A/B 使用同一候选位流和固件。</w:t>
+              <w:t>09:00 的 RC0 不依赖 A/B 第 7 天输出；最终验收记录单向依赖 A/B 使用同一 RC0 位流和固件所得结果。</w:t>
             </w:r>
           </w:p>
           <w:p>
@@ -4589,7 +4589,7 @@
                 <w:b w:val="0"/>
                 <w:sz w:val="17"/>
               </w:rPr>
-              <w:t>Render/Scanout/Asset 无协议错误；无未解释计数；生成物、源码、固件和位流哈希齐全。</w:t>
+              <w:t>RC0 哈希先固定；最终 Render/Scanout/Asset 无协议错误、无未解释计数，生成物、源码、固件和位流哈希齐全。若 RC0 失败，回到第 6 天生成编号递增的新候选，不在第 7 天原地互相等待。</w:t>
             </w:r>
           </w:p>
         </w:tc>
@@ -4707,7 +4707,7 @@
                 <w:b w:val="0"/>
                 <w:sz w:val="17"/>
               </w:rPr>
-              <w:t>第 6 天正式工程、B 的最终固件和 PC server。</w:t>
+              <w:t>负责人 09:00 冻结的 RC0、第 6 天正式工程，以及 B 在 11:00 前提供的最终固件、PC server 和资源包。</w:t>
             </w:r>
           </w:p>
           <w:p>
@@ -4729,7 +4729,7 @@
                 <w:b w:val="0"/>
                 <w:sz w:val="17"/>
               </w:rPr>
-              <w:t>同一候选版本的 bit/hex/报告/板测日志；不保存旧位流冒充结果。</w:t>
+              <w:t>14:00 前生成同一 RC0 的 bit/hex/报告，随后与 B 联合板测并形成日志；不保存旧位流冒充结果。</w:t>
             </w:r>
           </w:p>
           <w:p>
@@ -4751,7 +4751,7 @@
                 <w:b w:val="0"/>
                 <w:sz w:val="17"/>
               </w:rPr>
-              <w:t>负责人生成 RTL；B 提供 release ELF 和资源包。</w:t>
+              <w:t>单向依赖负责人 RC0 和 B 上午构建产物；A 的候选位流不作为 B 上午编译固件的前置条件。</w:t>
             </w:r>
           </w:p>
           <w:p>
@@ -4869,7 +4869,7 @@
                 <w:b w:val="0"/>
                 <w:sz w:val="17"/>
               </w:rPr>
-              <w:t>生成最终固件、服务器、资源包和演示脚本；记录 CPU/GPU FPS/加速比、各 Sprite 档位 300 帧 p5 FPS、上限、网络吞吐/重试、CRC、underflow 和错误。</w:t>
+              <w:t>上午按 RC0 寄存器版本生成最终固件、服务器、资源包和演示脚本；A 生成候选位流后，再记录 CPU/GPU FPS/加速比、各 Sprite 档位 300 帧 p5 FPS、上限、网络吞吐/重试、CRC、underflow 和错误。</w:t>
             </w:r>
           </w:p>
           <w:p>
@@ -4891,7 +4891,7 @@
                 <w:b w:val="0"/>
                 <w:sz w:val="17"/>
               </w:rPr>
-              <w:t>最终硬件、固定随机种子、同一资源包。</w:t>
+              <w:t>上午构建使用负责人 RC0、固定随机种子和同一资源包；下午板测才使用 A 的候选位流。</w:t>
             </w:r>
           </w:p>
           <w:p>
@@ -4935,7 +4935,7 @@
                 <w:b w:val="0"/>
                 <w:sz w:val="17"/>
               </w:rPr>
-              <w:t>A 的候选位流；负责人寄存器版本。</w:t>
+              <w:t>上午构建只依赖负责人 09:00 冻结的 RC0，不依赖 A 位流；下午性能记录单向依赖 A 14:00 前生成的候选位流。</w:t>
             </w:r>
           </w:p>
           <w:p>
@@ -4957,7 +4957,7 @@
                 <w:b w:val="0"/>
                 <w:sz w:val="17"/>
               </w:rPr>
-              <w:t>CPU/GPU CRC 相同；明确给出稳定 60 FPS 最大 Sprite 数；PC 进程 CPU 只做文件读取/UDP，不含帧循环或游戏状态。</w:t>
+              <w:t>11:00 前固件/服务器/资源包可供 A 构建；板测后 CPU/GPU CRC 相同，明确给出稳定 60 FPS 最大 Sprite 数，且 PC 进程只做文件读取/UDP。</w:t>
             </w:r>
           </w:p>
         </w:tc>

</xml_diff>